<commit_message>
Corregir ruta de arranque en 1_Iniciar_Programa_Local.bat
</commit_message>
<xml_diff>
--- a/docs/manuales/Manual_Instalacion_Local_Acceso_Externo.docx
+++ b/docs/manuales/Manual_Instalacion_Local_Acceso_Externo.docx
@@ -890,7 +890,305 @@
         <w:spacing w:after="200" w:before="300"/>
       </w:pPr>
       <w:r>
-        <w:t xml:space="preserve">6. Seguridad — a tener en cuenta</w:t>
+        <w:t xml:space="preserve">6. Arranque automático — sin abrir PowerShell nunca más</w:t>
+      </w:r>
+    </w:p>
+    <w:p>
+      <w:pPr>
+        <w:spacing w:after="160"/>
+      </w:pPr>
+      <w:r>
+        <w:rPr>
+          <w:b w:val="false"/>
+          <w:bCs w:val="false"/>
+          <w:i w:val="false"/>
+          <w:iCs w:val="false"/>
+        </w:rPr>
+        <w:t xml:space="preserve">Para no tener que abrir PowerShell cada vez, hay un configurador que deja todo arrancando solo con Windows, y dos accesos directos en el Escritorio para el uso diario.</w:t>
+      </w:r>
+    </w:p>
+    <w:p>
+      <w:pPr>
+        <w:pStyle w:val="Heading2"/>
+        <w:spacing w:after="120" w:before="240"/>
+      </w:pPr>
+      <w:r>
+        <w:t xml:space="preserve">Configurar (una sola vez)</w:t>
+      </w:r>
+    </w:p>
+    <w:p>
+      <w:pPr>
+        <w:spacing w:after="100"/>
+      </w:pPr>
+      <w:r>
+        <w:rPr>
+          <w:b/>
+          <w:bCs/>
+          <w:color w:val="0A8F86"/>
+        </w:rPr>
+        <w:t xml:space="preserve">1. </w:t>
+      </w:r>
+      <w:r>
+        <w:t xml:space="preserve">Doble clic en Configurar_Inicio_Automatico.bat (dentro de deploy/windows).</w:t>
+      </w:r>
+    </w:p>
+    <w:p>
+      <w:pPr>
+        <w:spacing w:after="100"/>
+      </w:pPr>
+      <w:r>
+        <w:rPr>
+          <w:b/>
+          <w:bCs/>
+          <w:color w:val="0A8F86"/>
+        </w:rPr>
+        <w:t xml:space="preserve">2. </w:t>
+      </w:r>
+      <w:r>
+        <w:t xml:space="preserve">Confirma que se crearon el arranque automático y los dos accesos directos del Escritorio.</w:t>
+      </w:r>
+    </w:p>
+    <w:p>
+      <w:pPr>
+        <w:spacing w:after="120"/>
+      </w:pPr>
+    </w:p>
+    <w:p>
+      <w:pPr>
+        <w:spacing w:after="160"/>
+      </w:pPr>
+      <w:r>
+        <w:rPr>
+          <w:b w:val="false"/>
+          <w:bCs w:val="false"/>
+          <w:i w:val="false"/>
+          <w:iCs w:val="false"/>
+        </w:rPr>
+        <w:t xml:space="preserve">A partir de ahí, cada vez que se prenda el computador y se inicie sesión en Windows, el programa y el túnel arrancan solos (en ventanas minimizadas, sin taparle la pantalla a nadie).</w:t>
+      </w:r>
+    </w:p>
+    <w:p>
+      <w:pPr>
+        <w:pStyle w:val="Heading2"/>
+        <w:spacing w:after="120" w:before="240"/>
+      </w:pPr>
+      <w:r>
+        <w:t xml:space="preserve">Los dos íconos del Escritorio</w:t>
+      </w:r>
+    </w:p>
+    <w:tbl>
+      <w:tblPr>
+        <w:tblW w:type="pct" w:w="100%"/>
+        <w:tblBorders>
+          <w:top w:val="single" w:color="auto" w:sz="4"/>
+          <w:left w:val="single" w:color="auto" w:sz="4"/>
+          <w:bottom w:val="single" w:color="auto" w:sz="4"/>
+          <w:right w:val="single" w:color="auto" w:sz="4"/>
+          <w:insideH w:val="single" w:color="auto" w:sz="4"/>
+          <w:insideV w:val="single" w:color="auto" w:sz="4"/>
+        </w:tblBorders>
+      </w:tblPr>
+      <w:tblGrid>
+        <w:gridCol w:w="4200"/>
+        <w:gridCol w:w="5300"/>
+      </w:tblGrid>
+      <w:tr>
+        <w:trPr>
+          <w:tblHeader/>
+        </w:trPr>
+        <w:tc>
+          <w:tcPr>
+            <w:tcW w:type="dxa" w:w="4200"/>
+            <w:shd w:fill="0A8F86" w:val="clear"/>
+            <w:tcMar>
+              <w:top w:type="dxa" w:w="100"/>
+              <w:left w:type="dxa" w:w="120"/>
+              <w:bottom w:type="dxa" w:w="100"/>
+              <w:right w:type="dxa" w:w="120"/>
+            </w:tcMar>
+          </w:tcPr>
+          <w:p>
+            <w:r>
+              <w:rPr>
+                <w:b/>
+                <w:bCs/>
+                <w:color w:val="FFFFFF"/>
+              </w:rPr>
+              <w:t xml:space="preserve">Ícono</w:t>
+            </w:r>
+          </w:p>
+        </w:tc>
+        <w:tc>
+          <w:tcPr>
+            <w:tcW w:type="dxa" w:w="5300"/>
+            <w:shd w:fill="0A8F86" w:val="clear"/>
+            <w:tcMar>
+              <w:top w:type="dxa" w:w="100"/>
+              <w:left w:type="dxa" w:w="120"/>
+              <w:bottom w:type="dxa" w:w="100"/>
+              <w:right w:type="dxa" w:w="120"/>
+            </w:tcMar>
+          </w:tcPr>
+          <w:p>
+            <w:r>
+              <w:rPr>
+                <w:b/>
+                <w:bCs/>
+                <w:color w:val="FFFFFF"/>
+              </w:rPr>
+              <w:t xml:space="preserve">Para qué sirve</w:t>
+            </w:r>
+          </w:p>
+        </w:tc>
+      </w:tr>
+      <w:tr>
+        <w:tc>
+          <w:tcPr>
+            <w:tcW w:type="dxa" w:w="4200"/>
+            <w:tcMar>
+              <w:top w:type="dxa" w:w="100"/>
+              <w:left w:type="dxa" w:w="120"/>
+              <w:bottom w:type="dxa" w:w="100"/>
+              <w:right w:type="dxa" w:w="120"/>
+            </w:tcMar>
+          </w:tcPr>
+          <w:p>
+            <w:r>
+              <w:rPr>
+                <w:b w:val="false"/>
+                <w:bCs w:val="false"/>
+              </w:rPr>
+              <w:t xml:space="preserve">HomeCare - Iniciar Todo</w:t>
+            </w:r>
+          </w:p>
+        </w:tc>
+        <w:tc>
+          <w:tcPr>
+            <w:tcW w:type="dxa" w:w="5300"/>
+            <w:tcMar>
+              <w:top w:type="dxa" w:w="100"/>
+              <w:left w:type="dxa" w:w="120"/>
+              <w:bottom w:type="dxa" w:w="100"/>
+              <w:right w:type="dxa" w:w="120"/>
+            </w:tcMar>
+          </w:tcPr>
+          <w:p>
+            <w:r>
+              <w:rPr>
+                <w:b w:val="false"/>
+                <w:bCs w:val="false"/>
+              </w:rPr>
+              <w:t xml:space="preserve">Arranca el programa y el túnel manualmente, sin tener que reiniciar el computador (por ejemplo, si se cerraron las ventanas sin querer).</w:t>
+            </w:r>
+          </w:p>
+        </w:tc>
+      </w:tr>
+      <w:tr>
+        <w:tc>
+          <w:tcPr>
+            <w:tcW w:type="dxa" w:w="4200"/>
+            <w:tcMar>
+              <w:top w:type="dxa" w:w="100"/>
+              <w:left w:type="dxa" w:w="120"/>
+              <w:bottom w:type="dxa" w:w="100"/>
+              <w:right w:type="dxa" w:w="120"/>
+            </w:tcMar>
+          </w:tcPr>
+          <w:p>
+            <w:r>
+              <w:rPr>
+                <w:b w:val="false"/>
+                <w:bCs w:val="false"/>
+              </w:rPr>
+              <w:t xml:space="preserve">HomeCare - Ver Dirección Externa</w:t>
+            </w:r>
+          </w:p>
+        </w:tc>
+        <w:tc>
+          <w:tcPr>
+            <w:tcW w:type="dxa" w:w="5300"/>
+            <w:tcMar>
+              <w:top w:type="dxa" w:w="100"/>
+              <w:left w:type="dxa" w:w="120"/>
+              <w:bottom w:type="dxa" w:w="100"/>
+              <w:right w:type="dxa" w:w="120"/>
+            </w:tcMar>
+          </w:tcPr>
+          <w:p>
+            <w:r>
+              <w:rPr>
+                <w:b w:val="false"/>
+                <w:bCs w:val="false"/>
+              </w:rPr>
+              <w:t xml:space="preserve">Consulta la dirección https:// actual, la copia sola al portapapeles, y la abre en el navegador — sin tener que buscarla en ninguna ventana.</w:t>
+            </w:r>
+          </w:p>
+        </w:tc>
+      </w:tr>
+    </w:tbl>
+    <w:p>
+      <w:pPr>
+        <w:spacing w:after="120"/>
+      </w:pPr>
+    </w:p>
+    <w:tbl>
+      <w:tblPr>
+        <w:tblW w:type="pct" w:w="100%"/>
+        <w:tblBorders>
+          <w:top w:val="single" w:color="auto" w:sz="4"/>
+          <w:left w:val="single" w:color="auto" w:sz="4"/>
+          <w:bottom w:val="single" w:color="auto" w:sz="4"/>
+          <w:right w:val="single" w:color="auto" w:sz="4"/>
+          <w:insideH w:val="single" w:color="auto" w:sz="4"/>
+          <w:insideV w:val="single" w:color="auto" w:sz="4"/>
+        </w:tblBorders>
+      </w:tblPr>
+      <w:tblGrid>
+        <w:gridCol w:w="100"/>
+      </w:tblGrid>
+      <w:tr>
+        <w:tc>
+          <w:tcPr>
+            <w:shd w:fill="E5FBF9" w:val="clear"/>
+            <w:tcMar>
+              <w:top w:type="dxa" w:w="150"/>
+              <w:left w:type="dxa" w:w="150"/>
+              <w:bottom w:type="dxa" w:w="150"/>
+              <w:right w:type="dxa" w:w="150"/>
+            </w:tcMar>
+          </w:tcPr>
+          <w:p>
+            <w:pPr>
+              <w:spacing w:after="60"/>
+            </w:pPr>
+            <w:r>
+              <w:rPr>
+                <w:b/>
+                <w:bCs/>
+              </w:rPr>
+              <w:t xml:space="preserve">💡 Recomendado: usar siempre el ícono de “Ver Dirección Externa”</w:t>
+            </w:r>
+          </w:p>
+          <w:p>
+            <w:r>
+              <w:t xml:space="preserve">Es la forma más rápida de conseguir la dirección del momento para compartirla o abrirla en el celular — la copia sola al portapapeles, lista para pegar.</w:t>
+            </w:r>
+          </w:p>
+        </w:tc>
+      </w:tr>
+    </w:tbl>
+    <w:p>
+      <w:pPr>
+        <w:spacing w:after="120"/>
+      </w:pPr>
+    </w:p>
+    <w:p>
+      <w:pPr>
+        <w:pStyle w:val="Heading1"/>
+        <w:spacing w:after="200" w:before="300"/>
+      </w:pPr>
+      <w:r>
+        <w:t xml:space="preserve">7. Seguridad — a tener en cuenta</w:t>
       </w:r>
     </w:p>
     <w:p>
@@ -943,7 +1241,7 @@
         <w:spacing w:after="200" w:before="300"/>
       </w:pPr>
       <w:r>
-        <w:t xml:space="preserve">7. Preguntas frecuentes</w:t>
+        <w:t xml:space="preserve">8. Preguntas frecuentes</w:t>
       </w:r>
     </w:p>
     <w:p>
@@ -1012,7 +1310,7 @@
           <w:i w:val="false"/>
           <w:iCs w:val="false"/>
         </w:rPr>
-        <w:t xml:space="preserve">Sí es posible, pero requiere pasos adicionales (registrar el túnel como tarea programada de Windows, y preferiblemente un dominio fijo de ngrok) — si se necesita, se puede ampliar esta configuración más adelante.</w:t>
+        <w:t xml:space="preserve">Sí — usando el configurador de arranque automático (sección 6). El programa y el túnel arrancan solos cada vez que se prende el computador, sin abrir PowerShell. La única salvedad: con el plan gratis de ngrok, la dirección https:// cambia en cada arranque — por eso conviene revisarla con el ícono “Ver Dirección Externa” en vez de guardarla de un día para otro.</w:t>
       </w:r>
     </w:p>
     <w:p>

</xml_diff>